<commit_message>
docs: architecture-variant evidence, design QA notes, doc updates
Add evidence/architecture-variants/ (rendered variant comparisons + QA notes),
design-qa.md, UAT screenshots, and video-demo doc edits. Remove stray Office
temp-lock files that had been committed by accident.

Co-Authored-By: Claude Opus 4.8 <noreply@anthropic.com>
</commit_message>
<xml_diff>
--- a/docs/Script for video demo.docx
+++ b/docs/Script for video demo.docx
@@ -42,12 +42,6 @@
       </w:r>
     </w:p>
     <w:p>
-      <w:r>
-        <w:t>.</w:t>
-      </w:r>
-      <w:r>
-        <w:br/>
-      </w:r>
       <w:r>
         <w:br/>
         <w:t xml:space="preserve">For how we start off, we should cover: </w:t>
@@ -540,32 +534,88 @@
       <w:r>
         <w:t xml:space="preserve">: </w:t>
       </w:r>
+      <w:bookmarkStart w:id="0" w:name="OLE_LINK3"/>
+      <w:r>
+        <w:fldChar w:fldCharType="begin"/>
+      </w:r>
+      <w:r>
+        <w:instrText>HYPERLINK "</w:instrText>
+      </w:r>
+      <w:r>
+        <w:instrText>https://github.com/NnamdiOdozi/llm_experiments_lab/</w:instrText>
+      </w:r>
+      <w:r>
+        <w:instrText>"</w:instrText>
+      </w:r>
+      <w:r>
+        <w:fldChar w:fldCharType="separate"/>
+      </w:r>
+      <w:r>
+        <w:rPr>
+          <w:rStyle w:val="Hyperlink"/>
+        </w:rPr>
+        <w:t>https://github.com/NnamdiOdozi/llm_experiments_lab/</w:t>
+      </w:r>
+      <w:r>
+        <w:fldChar w:fldCharType="end"/>
+      </w:r>
+    </w:p>
+    <w:p>
+      <w:r>
+        <w:t xml:space="preserve">Substack blog at: </w:t>
+      </w:r>
       <w:hyperlink r:id="rId5" w:history="1">
         <w:r>
           <w:rPr>
             <w:rStyle w:val="Hyperlink"/>
           </w:rPr>
-          <w:t>https://github.com/NnamdiOdozi/llm_experiments_lab/</w:t>
+          <w:t>https://nodozi.su</w:t>
+        </w:r>
+        <w:r>
+          <w:rPr>
+            <w:rStyle w:val="Hyperlink"/>
+          </w:rPr>
+          <w:t>b</w:t>
+        </w:r>
+        <w:r>
+          <w:rPr>
+            <w:rStyle w:val="Hyperlink"/>
+          </w:rPr>
+          <w:t>stack.com/p/what-if-you-could-pause-a-language</w:t>
         </w:r>
       </w:hyperlink>
-    </w:p>
-    <w:p>
-      <w:r>
-        <w:t xml:space="preserve">Substack blog at: </w:t>
-      </w:r>
+      <w:bookmarkEnd w:id="0"/>
+    </w:p>
+    <w:p/>
+    <w:p>
       <w:hyperlink r:id="rId6" w:history="1">
         <w:r>
           <w:rPr>
             <w:rStyle w:val="Hyperlink"/>
           </w:rPr>
-          <w:t>https://nodozi.substack.com/p/what-if-you-could-pause-a-language</w:t>
+          <w:t>https://youtu.be/QxOiSZJd0sA</w:t>
         </w:r>
       </w:hyperlink>
+      <w:r>
+        <w:br/>
+      </w:r>
+      <w:r>
+        <w:br/>
+      </w:r>
+      <w:r>
+        <w:t>https://github.com/NnamdiOdozi/llm_experiments_lab/</w:t>
+      </w:r>
+    </w:p>
+    <w:p>
+      <w:r>
+        <w:lastRenderedPageBreak/>
+        <w:t>https://www.linkedin.com/pulse/what-you-could-pause-language-model-mid-thought-nnamdi-odozi-fia-frm-w8sre/</w:t>
+      </w:r>
     </w:p>
     <w:p/>
     <w:p>
       <w:r>
-        <w:t>https://youtu.be/QxOiSZJd0sA</w:t>
+        <w:t>https://www.youtube.com/watch?v=QxOiSZJd0sA</w:t>
       </w:r>
     </w:p>
     <w:p/>
@@ -2095,6 +2145,18 @@
       <w:shd w:val="clear" w:color="auto" w:fill="E1DFDD"/>
     </w:rPr>
   </w:style>
+  <w:style w:type="character" w:styleId="FollowedHyperlink">
+    <w:name w:val="FollowedHyperlink"/>
+    <w:basedOn w:val="DefaultParagraphFont"/>
+    <w:uiPriority w:val="99"/>
+    <w:semiHidden/>
+    <w:unhideWhenUsed/>
+    <w:rsid w:val="003F5BF0"/>
+    <w:rPr>
+      <w:color w:val="96607D" w:themeColor="followedHyperlink"/>
+      <w:u w:val="single"/>
+    </w:rPr>
+  </w:style>
 </w:styles>
 </file>
 

</xml_diff>